<commit_message>
fix: chatbot lịch chiếu - query theo showDate thay vì startTime (string), cải thiện format hiển thị
</commit_message>
<xml_diff>
--- a/TomTatDATN.docx
+++ b/TomTatDATN.docx
@@ -131,7 +131,37 @@
             </w:pPr>
             <w:r>
               <w:rPr/>
-              <w:t>-----***-----</w:t>
+              <w:t>-----</w:t>
+            </w:r>
+            <w:r>
+              <w:rPr>
+                <w:rFonts w:eastAsia="Quattrocento Sans"/>
+                <w:b w:val="false"/>
+                <w:bCs w:val="false"/>
+              </w:rPr>
+              <w:t>🙞</w:t>
+            </w:r>
+            <w:r>
+              <w:rPr>
+                <w:rFonts w:eastAsia="Quattrocento Sans" w:cs="Segoe UI Symbol" w:ascii="Segoe UI Symbol" w:hAnsi="Segoe UI Symbol"/>
+                <w:b w:val="false"/>
+                <w:bCs w:val="false"/>
+              </w:rPr>
+              <w:t>🕮</w:t>
+            </w:r>
+            <w:r>
+              <w:rPr>
+                <w:rFonts w:eastAsia="Segoe UI Symbol" w:ascii="Segoe UI Symbol" w:hAnsi="Segoe UI Symbol"/>
+                <w:b w:val="false"/>
+                <w:bCs w:val="false"/>
+                <w:spacing w:val="-5"/>
+                <w:sz w:val="27"/>
+              </w:rPr>
+              <w:t>🙜</w:t>
+            </w:r>
+            <w:r>
+              <w:rPr/>
+              <w:t>-----</w:t>
             </w:r>
           </w:p>
           <w:p>
@@ -237,22 +267,14 @@
               <w:pStyle w:val="normal1"/>
               <w:jc w:val="center"/>
               <w:rPr>
-                <w:i/>
-                <w:i/>
-                <w:iCs/>
-                <w:color w:val="FF0000"/>
-                <w:sz w:val="28"/>
-                <w:szCs w:val="28"/>
-              </w:rPr>
-            </w:pPr>
-            <w:r>
-              <w:rPr>
-                <w:i/>
-                <w:iCs/>
-                <w:color w:val="FF0000"/>
-                <w:sz w:val="28"/>
-                <w:szCs w:val="28"/>
-              </w:rPr>
+                <w:b/>
+                <w:bCs/>
+                <w:sz w:val="32"/>
+                <w:szCs w:val="32"/>
+              </w:rPr>
+            </w:pPr>
+            <w:r>
+              <w:rPr/>
             </w:r>
           </w:p>
           <w:p>
@@ -280,17 +302,6 @@
                     <w:szCs w:val="32"/>
                   </w:rPr>
                 </w:r>
-                <w:ins w:id="0" w:author="Nguyên Đào" w:date="2026-05-25T13:18:43Z">
-                  <w:r>
-                    <w:rPr>
-                      <w:b/>
-                      <w:bCs/>
-                      <w:sz w:val="32"/>
-                      <w:szCs w:val="32"/>
-                    </w:rPr>
-                    <w:t xml:space="preserve"> </w:t>
-                  </w:r>
-                </w:ins>
                 <w:r>
                   <w:rPr>
                     <w:b/>
@@ -611,14 +622,14 @@
         </w:tblCellMar>
       </w:tblPr>
       <w:tblGrid>
-        <w:gridCol w:w="3199"/>
-        <w:gridCol w:w="6195"/>
+        <w:gridCol w:w="3198"/>
+        <w:gridCol w:w="6196"/>
       </w:tblGrid>
       <w:tr>
         <w:trPr/>
         <w:tc>
           <w:tcPr>
-            <w:tcW w:w="3199" w:type="dxa"/>
+            <w:tcW w:w="3198" w:type="dxa"/>
             <w:tcBorders>
               <w:top w:val="single" w:sz="4" w:space="0" w:color="000000"/>
               <w:left w:val="single" w:sz="4" w:space="0" w:color="000000"/>
@@ -647,7 +658,7 @@
         </w:tc>
         <w:tc>
           <w:tcPr>
-            <w:tcW w:w="6195" w:type="dxa"/>
+            <w:tcW w:w="6196" w:type="dxa"/>
             <w:tcBorders>
               <w:top w:val="single" w:sz="4" w:space="0" w:color="000000"/>
               <w:left w:val="single" w:sz="4" w:space="0" w:color="000000"/>
@@ -676,7 +687,7 @@
         <w:trPr/>
         <w:tc>
           <w:tcPr>
-            <w:tcW w:w="3199" w:type="dxa"/>
+            <w:tcW w:w="3198" w:type="dxa"/>
             <w:tcBorders>
               <w:top w:val="single" w:sz="4" w:space="0" w:color="000000"/>
               <w:left w:val="single" w:sz="4" w:space="0" w:color="000000"/>
@@ -705,7 +716,7 @@
         </w:tc>
         <w:tc>
           <w:tcPr>
-            <w:tcW w:w="6195" w:type="dxa"/>
+            <w:tcW w:w="6196" w:type="dxa"/>
             <w:tcBorders>
               <w:top w:val="single" w:sz="4" w:space="0" w:color="000000"/>
               <w:left w:val="single" w:sz="4" w:space="0" w:color="000000"/>
@@ -734,7 +745,7 @@
         <w:trPr/>
         <w:tc>
           <w:tcPr>
-            <w:tcW w:w="3199" w:type="dxa"/>
+            <w:tcW w:w="3198" w:type="dxa"/>
             <w:tcBorders>
               <w:top w:val="single" w:sz="4" w:space="0" w:color="000000"/>
               <w:left w:val="single" w:sz="4" w:space="0" w:color="000000"/>
@@ -763,7 +774,7 @@
         </w:tc>
         <w:tc>
           <w:tcPr>
-            <w:tcW w:w="6195" w:type="dxa"/>
+            <w:tcW w:w="6196" w:type="dxa"/>
             <w:tcBorders>
               <w:top w:val="single" w:sz="4" w:space="0" w:color="000000"/>
               <w:left w:val="single" w:sz="4" w:space="0" w:color="000000"/>
@@ -792,7 +803,7 @@
         <w:trPr/>
         <w:tc>
           <w:tcPr>
-            <w:tcW w:w="3199" w:type="dxa"/>
+            <w:tcW w:w="3198" w:type="dxa"/>
             <w:tcBorders>
               <w:top w:val="single" w:sz="4" w:space="0" w:color="000000"/>
               <w:left w:val="single" w:sz="4" w:space="0" w:color="000000"/>
@@ -821,7 +832,7 @@
         </w:tc>
         <w:tc>
           <w:tcPr>
-            <w:tcW w:w="6195" w:type="dxa"/>
+            <w:tcW w:w="6196" w:type="dxa"/>
             <w:tcBorders>
               <w:top w:val="single" w:sz="4" w:space="0" w:color="000000"/>
               <w:left w:val="single" w:sz="4" w:space="0" w:color="000000"/>
@@ -850,7 +861,7 @@
         <w:trPr/>
         <w:tc>
           <w:tcPr>
-            <w:tcW w:w="3199" w:type="dxa"/>
+            <w:tcW w:w="3198" w:type="dxa"/>
             <w:tcBorders>
               <w:top w:val="single" w:sz="4" w:space="0" w:color="000000"/>
               <w:left w:val="single" w:sz="4" w:space="0" w:color="000000"/>
@@ -879,7 +890,7 @@
         </w:tc>
         <w:tc>
           <w:tcPr>
-            <w:tcW w:w="6195" w:type="dxa"/>
+            <w:tcW w:w="6196" w:type="dxa"/>
             <w:tcBorders>
               <w:top w:val="single" w:sz="4" w:space="0" w:color="000000"/>
               <w:left w:val="single" w:sz="4" w:space="0" w:color="000000"/>
@@ -908,7 +919,7 @@
         <w:trPr/>
         <w:tc>
           <w:tcPr>
-            <w:tcW w:w="3199" w:type="dxa"/>
+            <w:tcW w:w="3198" w:type="dxa"/>
             <w:tcBorders>
               <w:top w:val="single" w:sz="4" w:space="0" w:color="000000"/>
               <w:left w:val="single" w:sz="4" w:space="0" w:color="000000"/>
@@ -937,7 +948,7 @@
         </w:tc>
         <w:tc>
           <w:tcPr>
-            <w:tcW w:w="6195" w:type="dxa"/>
+            <w:tcW w:w="6196" w:type="dxa"/>
             <w:tcBorders>
               <w:top w:val="single" w:sz="4" w:space="0" w:color="000000"/>
               <w:left w:val="single" w:sz="4" w:space="0" w:color="000000"/>
@@ -1379,7 +1390,7 @@
               <w:widowControl/>
               <w:suppressAutoHyphens w:val="true"/>
               <w:bidi w:val="0"/>
-              <w:spacing w:lineRule="auto" w:line="312" w:before="60" w:after="60"/>
+              <w:spacing w:lineRule="auto" w:line="312" w:before="0" w:after="60"/>
               <w:jc w:val="left"/>
               <w:rPr/>
             </w:pPr>
@@ -2135,7 +2146,10 @@
         </w:rPr>
       </w:pPr>
       <w:r>
-        <w:rPr/>
+        <w:rPr>
+          <w:b/>
+          <w:bCs/>
+        </w:rPr>
       </w:r>
     </w:p>
     <w:p>

</xml_diff>